<commit_message>
docs: mise à jour doc
</commit_message>
<xml_diff>
--- a/Scalar_Presentation.docx
+++ b/Scalar_Presentation.docx
@@ -7,6 +7,7 @@
         <w:spacing w:after="40"/>
         <w:jc w:val="center"/>
       </w:pPr>
+      <w:proofErr w:type="spellStart"/>
       <w:r>
         <w:rPr>
           <w:b/>
@@ -17,6 +18,7 @@
         </w:rPr>
         <w:t>Scalar</w:t>
       </w:r>
+      <w:proofErr w:type="spellEnd"/>
     </w:p>
     <w:p>
       <w:pPr>
@@ -76,8 +78,13 @@
       <w:pPr>
         <w:spacing w:before="60" w:after="60"/>
       </w:pPr>
-      <w:r>
-        <w:t>Scalar est une plateforme web d'apprentissage du développement informatique, accessible à tous les niveaux — débutant complet, autodidacte, ou développeur en reconversion.</w:t>
+      <w:proofErr w:type="spellStart"/>
+      <w:r>
+        <w:t>Scalar</w:t>
+      </w:r>
+      <w:proofErr w:type="spellEnd"/>
+      <w:r>
+        <w:t xml:space="preserve"> est une plateforme web d'apprentissage du développement informatique, accessible à tous les niveaux — débutant complet, autodidacte, ou développeur en reconversion.</w:t>
       </w:r>
     </w:p>
     <w:p>
@@ -93,7 +100,23 @@
         <w:spacing w:before="60" w:after="60"/>
       </w:pPr>
       <w:r>
-        <w:t>Le code soumis est exécuté dans une sandbox Docker sécurisée pour une validation concrète. Un modèle freemium permet de démarrer gratuitement, puis de s'abonner via Stripe pour débloquer l'intégralité du contenu et viser une certification.</w:t>
+        <w:t xml:space="preserve">Le code soumis est exécuté dans une </w:t>
+      </w:r>
+      <w:proofErr w:type="spellStart"/>
+      <w:r>
+        <w:t>sandbox</w:t>
+      </w:r>
+      <w:proofErr w:type="spellEnd"/>
+      <w:r>
+        <w:t xml:space="preserve"> Docker sécurisée pour une validation concrète. Un modèle freemium permet de démarrer gratuitement, puis de s'abonner via </w:t>
+      </w:r>
+      <w:proofErr w:type="spellStart"/>
+      <w:r>
+        <w:t>Stripe</w:t>
+      </w:r>
+      <w:proofErr w:type="spellEnd"/>
+      <w:r>
+        <w:t xml:space="preserve"> pour débloquer l'intégralité du contenu et viser une certification.</w:t>
       </w:r>
     </w:p>
     <w:p>
@@ -271,8 +294,20 @@
                 <w:sz w:val="20"/>
                 <w:szCs w:val="20"/>
               </w:rPr>
-              <w:t>Vue.js + TypeScript</w:t>
-            </w:r>
+              <w:t xml:space="preserve">Vue.js + </w:t>
+            </w:r>
+            <w:proofErr w:type="spellStart"/>
+            <w:r>
+              <w:rPr>
+                <w:b/>
+                <w:bCs/>
+                <w:color w:val="2E75B6"/>
+                <w:sz w:val="20"/>
+                <w:szCs w:val="20"/>
+              </w:rPr>
+              <w:t>TypeScript</w:t>
+            </w:r>
+            <w:proofErr w:type="spellEnd"/>
           </w:p>
         </w:tc>
         <w:tc>
@@ -334,6 +369,7 @@
             </w:tcMar>
           </w:tcPr>
           <w:p>
+            <w:proofErr w:type="spellStart"/>
             <w:r>
               <w:rPr>
                 <w:b/>
@@ -342,7 +378,18 @@
                 <w:sz w:val="20"/>
                 <w:szCs w:val="20"/>
               </w:rPr>
-              <w:t>Tailwind CSS</w:t>
+              <w:t>Tailwind</w:t>
+            </w:r>
+            <w:proofErr w:type="spellEnd"/>
+            <w:r>
+              <w:rPr>
+                <w:b/>
+                <w:bCs/>
+                <w:color w:val="2E75B6"/>
+                <w:sz w:val="20"/>
+                <w:szCs w:val="20"/>
+              </w:rPr>
+              <w:t xml:space="preserve"> CSS</w:t>
             </w:r>
           </w:p>
         </w:tc>
@@ -405,6 +452,7 @@
             </w:tcMar>
           </w:tcPr>
           <w:p>
+            <w:proofErr w:type="spellStart"/>
             <w:r>
               <w:rPr>
                 <w:b/>
@@ -415,6 +463,7 @@
               </w:rPr>
               <w:t>Figma</w:t>
             </w:r>
+            <w:proofErr w:type="spellEnd"/>
           </w:p>
         </w:tc>
         <w:tc>
@@ -484,7 +533,7 @@
                 <w:sz w:val="20"/>
                 <w:szCs w:val="20"/>
               </w:rPr>
-              <w:t>Symfony (PHP)</w:t>
+              <w:t>Node.js / Express</w:t>
             </w:r>
           </w:p>
         </w:tc>
@@ -571,13 +620,47 @@
             </w:tcMar>
           </w:tcPr>
           <w:p>
-            <w:r>
-              <w:rPr>
-                <w:sz w:val="20"/>
-                <w:szCs w:val="20"/>
-              </w:rPr>
-              <w:t>Microservice temps réel — WebSocket, validation des exercices, communication avec la sandbox</w:t>
-            </w:r>
+            <w:proofErr w:type="spellStart"/>
+            <w:r>
+              <w:rPr>
+                <w:sz w:val="20"/>
+                <w:szCs w:val="20"/>
+              </w:rPr>
+              <w:t>Microservice</w:t>
+            </w:r>
+            <w:proofErr w:type="spellEnd"/>
+            <w:r>
+              <w:rPr>
+                <w:sz w:val="20"/>
+                <w:szCs w:val="20"/>
+              </w:rPr>
+              <w:t xml:space="preserve"> temps réel — </w:t>
+            </w:r>
+            <w:proofErr w:type="spellStart"/>
+            <w:r>
+              <w:rPr>
+                <w:sz w:val="20"/>
+                <w:szCs w:val="20"/>
+              </w:rPr>
+              <w:t>WebSocket</w:t>
+            </w:r>
+            <w:proofErr w:type="spellEnd"/>
+            <w:r>
+              <w:rPr>
+                <w:sz w:val="20"/>
+                <w:szCs w:val="20"/>
+              </w:rPr>
+              <w:t xml:space="preserve">, validation des exercices, communication avec la </w:t>
+            </w:r>
+            <w:proofErr w:type="spellStart"/>
+            <w:r>
+              <w:rPr>
+                <w:sz w:val="20"/>
+                <w:szCs w:val="20"/>
+              </w:rPr>
+              <w:t>sandbox</w:t>
+            </w:r>
+            <w:proofErr w:type="spellEnd"/>
           </w:p>
         </w:tc>
       </w:tr>
@@ -760,6 +843,7 @@
             </w:tcMar>
           </w:tcPr>
           <w:p>
+            <w:proofErr w:type="spellStart"/>
             <w:r>
               <w:rPr>
                 <w:b/>
@@ -770,6 +854,7 @@
               </w:rPr>
               <w:t>Stripe</w:t>
             </w:r>
+            <w:proofErr w:type="spellEnd"/>
           </w:p>
         </w:tc>
         <w:tc>
@@ -831,6 +916,7 @@
             </w:tcMar>
           </w:tcPr>
           <w:p>
+            <w:proofErr w:type="spellStart"/>
             <w:r>
               <w:rPr>
                 <w:b/>
@@ -839,8 +925,31 @@
                 <w:sz w:val="20"/>
                 <w:szCs w:val="20"/>
               </w:rPr>
-              <w:t>Stripe Webhooks</w:t>
-            </w:r>
+              <w:t>Stripe</w:t>
+            </w:r>
+            <w:proofErr w:type="spellEnd"/>
+            <w:r>
+              <w:rPr>
+                <w:b/>
+                <w:bCs/>
+                <w:color w:val="2E75B6"/>
+                <w:sz w:val="20"/>
+                <w:szCs w:val="20"/>
+              </w:rPr>
+              <w:t xml:space="preserve"> </w:t>
+            </w:r>
+            <w:proofErr w:type="spellStart"/>
+            <w:r>
+              <w:rPr>
+                <w:b/>
+                <w:bCs/>
+                <w:color w:val="2E75B6"/>
+                <w:sz w:val="20"/>
+                <w:szCs w:val="20"/>
+              </w:rPr>
+              <w:t>Webhooks</w:t>
+            </w:r>
+            <w:proofErr w:type="spellEnd"/>
           </w:p>
         </w:tc>
         <w:tc>
@@ -931,7 +1040,23 @@
                 <w:sz w:val="20"/>
                 <w:szCs w:val="20"/>
               </w:rPr>
-              <w:t>Conteneurisation complète en développement et en production — sandbox isolée pour le code utilisateur</w:t>
+              <w:t xml:space="preserve">Conteneurisation complète en développement et en production — </w:t>
+            </w:r>
+            <w:proofErr w:type="spellStart"/>
+            <w:r>
+              <w:rPr>
+                <w:sz w:val="20"/>
+                <w:szCs w:val="20"/>
+              </w:rPr>
+              <w:t>sandbox</w:t>
+            </w:r>
+            <w:proofErr w:type="spellEnd"/>
+            <w:r>
+              <w:rPr>
+                <w:sz w:val="20"/>
+                <w:szCs w:val="20"/>
+              </w:rPr>
+              <w:t xml:space="preserve"> isolée pour le code utilisateur</w:t>
             </w:r>
           </w:p>
         </w:tc>
@@ -1074,7 +1199,23 @@
                 <w:sz w:val="20"/>
                 <w:szCs w:val="20"/>
               </w:rPr>
-              <w:t>CI/CD automatisé — tests, build, déploiement, audit de sécurité des dépendances NPM et Composer</w:t>
+              <w:t xml:space="preserve">CI/CD automatisé — tests, </w:t>
+            </w:r>
+            <w:proofErr w:type="spellStart"/>
+            <w:r>
+              <w:rPr>
+                <w:sz w:val="20"/>
+                <w:szCs w:val="20"/>
+              </w:rPr>
+              <w:t>build</w:t>
+            </w:r>
+            <w:proofErr w:type="spellEnd"/>
+            <w:r>
+              <w:rPr>
+                <w:sz w:val="20"/>
+                <w:szCs w:val="20"/>
+              </w:rPr>
+              <w:t>, déploiement, audit de sécurité des dépendances NPM et Composer</w:t>
             </w:r>
           </w:p>
         </w:tc>
@@ -1116,6 +1257,7 @@
             </w:tcMar>
           </w:tcPr>
           <w:p>
+            <w:proofErr w:type="spellStart"/>
             <w:r>
               <w:rPr>
                 <w:b/>
@@ -1126,6 +1268,7 @@
               </w:rPr>
               <w:t>Swagger</w:t>
             </w:r>
+            <w:proofErr w:type="spellEnd"/>
           </w:p>
         </w:tc>
         <w:tc>
@@ -1145,8 +1288,17 @@
                 <w:sz w:val="20"/>
                 <w:szCs w:val="20"/>
               </w:rPr>
-              <w:t>Documentation interactive et complète de l'API REST pour tous les endpoints</w:t>
-            </w:r>
+              <w:t xml:space="preserve">Documentation interactive et complète de l'API REST pour tous les </w:t>
+            </w:r>
+            <w:proofErr w:type="spellStart"/>
+            <w:r>
+              <w:rPr>
+                <w:sz w:val="20"/>
+                <w:szCs w:val="20"/>
+              </w:rPr>
+              <w:t>endpoints</w:t>
+            </w:r>
+            <w:proofErr w:type="spellEnd"/>
           </w:p>
         </w:tc>
       </w:tr>
@@ -1249,7 +1401,15 @@
         <w:spacing w:before="50" w:after="50"/>
       </w:pPr>
       <w:r>
-        <w:t>Validation des exercices via sandbox Docker</w:t>
+        <w:t xml:space="preserve">Validation des exercices via </w:t>
+      </w:r>
+      <w:proofErr w:type="spellStart"/>
+      <w:r>
+        <w:t>sandbox</w:t>
+      </w:r>
+      <w:proofErr w:type="spellEnd"/>
+      <w:r>
+        <w:t xml:space="preserve"> Docker</w:t>
       </w:r>
     </w:p>
     <w:p>
@@ -1282,8 +1442,20 @@
           <w:sz w:val="26"/>
           <w:szCs w:val="26"/>
         </w:rPr>
-        <w:t>Plan Premium — via Stripe</w:t>
-      </w:r>
+        <w:t xml:space="preserve">Plan Premium — via </w:t>
+      </w:r>
+      <w:proofErr w:type="spellStart"/>
+      <w:r>
+        <w:rPr>
+          <w:b/>
+          <w:bCs/>
+          <w:color w:val="2E75B6"/>
+          <w:sz w:val="26"/>
+          <w:szCs w:val="26"/>
+        </w:rPr>
+        <w:t>Stripe</w:t>
+      </w:r>
+      <w:proofErr w:type="spellEnd"/>
     </w:p>
     <w:p>
       <w:pPr>
@@ -1494,7 +1666,15 @@
         <w:spacing w:before="50" w:after="50"/>
       </w:pPr>
       <w:r>
-        <w:t>Voir son code validé ou rejeté par la sandbox Docker en temps réel</w:t>
+        <w:t xml:space="preserve">Voir son code validé ou rejeté par la </w:t>
+      </w:r>
+      <w:proofErr w:type="spellStart"/>
+      <w:r>
+        <w:t>sandbox</w:t>
+      </w:r>
+      <w:proofErr w:type="spellEnd"/>
+      <w:r>
+        <w:t xml:space="preserve"> Docker en temps réel</w:t>
       </w:r>
     </w:p>
     <w:p>
@@ -1593,8 +1773,13 @@
         <w:spacing w:before="50" w:after="50"/>
       </w:pPr>
       <w:r>
-        <w:t>Gérer son abonnement — renouvellement, résiliation via Stripe</w:t>
-      </w:r>
+        <w:t xml:space="preserve">Gérer son abonnement — renouvellement, résiliation via </w:t>
+      </w:r>
+      <w:proofErr w:type="spellStart"/>
+      <w:r>
+        <w:t>Stripe</w:t>
+      </w:r>
+      <w:proofErr w:type="spellEnd"/>
     </w:p>
     <w:p>
       <w:pPr>
@@ -1681,8 +1866,20 @@
           <w:sz w:val="34"/>
           <w:szCs w:val="34"/>
         </w:rPr>
-        <w:t>Impact vs un simple prompt IA</w:t>
-      </w:r>
+        <w:t xml:space="preserve">Impact vs </w:t>
+      </w:r>
+      <w:proofErr w:type="gramStart"/>
+      <w:r>
+        <w:rPr>
+          <w:b/>
+          <w:bCs/>
+          <w:color w:val="1E3A5F"/>
+          <w:sz w:val="34"/>
+          <w:szCs w:val="34"/>
+        </w:rPr>
+        <w:t>un simple prompt IA</w:t>
+      </w:r>
+      <w:proofErr w:type="gramEnd"/>
     </w:p>
     <w:p>
       <w:pPr>
@@ -1694,7 +1891,23 @@
         <w:spacing w:before="60" w:after="60"/>
       </w:pPr>
       <w:r>
-        <w:t>Un utilisateur peut demander à ChatGPT d'expliquer un concept ou générer un exercice. Scalar va fondamentalement plus loin.</w:t>
+        <w:t xml:space="preserve">Un utilisateur peut demander à </w:t>
+      </w:r>
+      <w:proofErr w:type="spellStart"/>
+      <w:r>
+        <w:t>ChatGPT</w:t>
+      </w:r>
+      <w:proofErr w:type="spellEnd"/>
+      <w:r>
+        <w:t xml:space="preserve"> d'expliquer un concept ou générer un exercice. </w:t>
+      </w:r>
+      <w:proofErr w:type="spellStart"/>
+      <w:r>
+        <w:t>Scalar</w:t>
+      </w:r>
+      <w:proofErr w:type="spellEnd"/>
+      <w:r>
+        <w:t xml:space="preserve"> va fondamentalement plus loin.</w:t>
       </w:r>
     </w:p>
     <w:p>
@@ -1799,7 +2012,29 @@
           <w:sz w:val="26"/>
           <w:szCs w:val="26"/>
         </w:rPr>
-        <w:t>Ce que Scalar apporte en plus</w:t>
+        <w:t xml:space="preserve">Ce que </w:t>
+      </w:r>
+      <w:proofErr w:type="spellStart"/>
+      <w:r>
+        <w:rPr>
+          <w:b/>
+          <w:bCs/>
+          <w:color w:val="2E75B6"/>
+          <w:sz w:val="26"/>
+          <w:szCs w:val="26"/>
+        </w:rPr>
+        <w:t>Scalar</w:t>
+      </w:r>
+      <w:proofErr w:type="spellEnd"/>
+      <w:r>
+        <w:rPr>
+          <w:b/>
+          <w:bCs/>
+          <w:color w:val="2E75B6"/>
+          <w:sz w:val="26"/>
+          <w:szCs w:val="26"/>
+        </w:rPr>
+        <w:t xml:space="preserve"> apporte en plus</w:t>
       </w:r>
     </w:p>
     <w:p>
@@ -1851,7 +2086,15 @@
         <w:spacing w:before="50" w:after="50"/>
       </w:pPr>
       <w:r>
-        <w:t>Une alternative accessible à OpenClassrooms — moins cher, plus personnalisé</w:t>
+        <w:t xml:space="preserve">Une alternative accessible à </w:t>
+      </w:r>
+      <w:proofErr w:type="spellStart"/>
+      <w:r>
+        <w:t>OpenClassrooms</w:t>
+      </w:r>
+      <w:proofErr w:type="spellEnd"/>
+      <w:r>
+        <w:t xml:space="preserve"> — moins cher, plus personnalisé</w:t>
       </w:r>
     </w:p>
     <w:p>
@@ -1876,8 +2119,21 @@
       <w:pPr>
         <w:spacing w:before="60" w:after="60"/>
       </w:pPr>
-      <w:r>
-        <w:t>Un prompt IA donne une réponse. Scalar construit un développeur.</w:t>
+      <w:proofErr w:type="gramStart"/>
+      <w:r>
+        <w:t>Un prompt IA</w:t>
+      </w:r>
+      <w:proofErr w:type="gramEnd"/>
+      <w:r>
+        <w:t xml:space="preserve"> donne une réponse. </w:t>
+      </w:r>
+      <w:proofErr w:type="spellStart"/>
+      <w:r>
+        <w:t>Scalar</w:t>
+      </w:r>
+      <w:proofErr w:type="spellEnd"/>
+      <w:r>
+        <w:t xml:space="preserve"> construit un développeur.</w:t>
       </w:r>
     </w:p>
     <w:p>
@@ -1898,6 +2154,7 @@
         <w:spacing w:before="300"/>
         <w:jc w:val="center"/>
       </w:pPr>
+      <w:proofErr w:type="spellStart"/>
       <w:r>
         <w:rPr>
           <w:i/>
@@ -1906,7 +2163,18 @@
           <w:sz w:val="18"/>
           <w:szCs w:val="18"/>
         </w:rPr>
-        <w:t>Scalar — Présentation projet v1.0</w:t>
+        <w:t>Scalar</w:t>
+      </w:r>
+      <w:proofErr w:type="spellEnd"/>
+      <w:r>
+        <w:rPr>
+          <w:i/>
+          <w:iCs/>
+          <w:color w:val="AAAAAA"/>
+          <w:sz w:val="18"/>
+          <w:szCs w:val="18"/>
+        </w:rPr>
+        <w:t xml:space="preserve"> — Présentation projet v1.0</w:t>
       </w:r>
     </w:p>
     <w:sectPr>

</xml_diff>